<commit_message>
docs(note-de-cadrage): mise à jour ciblée v1.2 — orientation TB 140+ + archivage automatisé
- En-tête : version 1.2, date 28/06/2026, périmètre 'TB 140 ESR recommandé'.
- §1 : contraintes réécrites (140+ privilégié, compat. ascendante vérifiée).
- §2 : sous-section 'Archivage : manuel ou automatisé' (AutoarchiveReloaded).
- §6 : +README.md, 5-installer, aide-dates, policies.json.exemple, assets/, module.
- §7 : +deux versions sur un poste, compat. module, push SAN manuel.
- §8 : arborescence réécrite (nom du repo + nouveaux fichiers).
- §9 : +T11 archivage automatisé. §11 : ESR 140+ recommandée.
</commit_message>
<xml_diff>
--- a/Note-de-cadrage.docx
+++ b/Note-de-cadrage.docx
@@ -182,15 +182,7 @@
           </w:tcPr>
           <w:p>
             <w:r>
-              <w:t xml:space="preserve">Postes Windows · clients Thunderbird de la version 31.7.0 aux branches actuelles (jusqu'à 140) · répertoire partagé </w:t>
-            </w:r>
-            <w:proofErr w:type="gramStart"/>
-            <w:r>
-              <w:t>sur</w:t>
-            </w:r>
-            <w:proofErr w:type="gramEnd"/>
-            <w:r>
-              <w:t xml:space="preserve"> SAN local.</w:t>
+              <w:t>Version recommandée : Thunderbird 140 ESR (compatibilité conservée jusqu'à 31.7.0). Postes Windows · répertoire partagé sur SAN local.</w:t>
             </w:r>
           </w:p>
         </w:tc>
@@ -249,10 +241,7 @@
           </w:tcPr>
           <w:p>
             <w:r>
-              <w:t>1.1</w:t>
-            </w:r>
-            <w:r>
-              <w:t xml:space="preserve"> état testé en développement</w:t>
+              <w:t>1.2 — orientation Thunderbird 140+ et archivage automatisé</w:t>
             </w:r>
           </w:p>
         </w:tc>
@@ -311,13 +300,7 @@
           </w:tcPr>
           <w:p>
             <w:r>
-              <w:t>2</w:t>
-            </w:r>
-            <w:r>
-              <w:t>9</w:t>
-            </w:r>
-            <w:r>
-              <w:t xml:space="preserve"> juin 2026</w:t>
+              <w:t>28 juin 2026</w:t>
             </w:r>
           </w:p>
         </w:tc>
@@ -838,27 +821,9 @@
       </w:pPr>
       <w:proofErr w:type="gramStart"/>
       <w:r>
-        <w:t>parc</w:t>
+        <w:t>parc potentiellement hétérogène (clients Thunderbird anciens, branches 31.x à 69.x) ; la version 140+ (ESR) est désormais privilégiée, en particulier sur le poste central ;</w:t>
       </w:r>
       <w:proofErr w:type="gramEnd"/>
-      <w:r>
-        <w:t xml:space="preserve"> potentiellement hétérogène</w:t>
-      </w:r>
-      <w:r>
-        <w:t xml:space="preserve">, </w:t>
-      </w:r>
-      <w:r>
-        <w:t xml:space="preserve">clients Thunderbird anciens (branches 31.x à </w:t>
-      </w:r>
-      <w:r>
-        <w:t>69</w:t>
-      </w:r>
-      <w:r>
-        <w:t>.x</w:t>
-      </w:r>
-      <w:r>
-        <w:t>)</w:t>
-      </w:r>
     </w:p>
     <w:p>
       <w:pPr>
@@ -871,49 +836,13 @@
       </w:pPr>
       <w:proofErr w:type="gramStart"/>
       <w:r>
-        <w:t>une</w:t>
+        <w:t>compatibilité ascendante vérifiée jusqu'à Thunderbird 140+ ; les versions anciennes restent supportées pour la consultation.</w:t>
       </w:r>
       <w:proofErr w:type="gramEnd"/>
-      <w:r>
-        <w:t xml:space="preserve"> </w:t>
-      </w:r>
-      <w:r>
-        <w:t xml:space="preserve">évolution vers </w:t>
-      </w:r>
       <w:proofErr w:type="spellStart"/>
-      <w:r>
-        <w:t>thunderbird</w:t>
-      </w:r>
       <w:proofErr w:type="spellEnd"/>
-      <w:r>
-        <w:t xml:space="preserve"> </w:t>
-      </w:r>
-      <w:r>
-        <w:t xml:space="preserve">140+ </w:t>
-      </w:r>
-      <w:r>
-        <w:t xml:space="preserve">étant </w:t>
-      </w:r>
-      <w:r>
-        <w:t>envisagée en 2027</w:t>
-      </w:r>
-      <w:r>
-        <w:t xml:space="preserve">, la </w:t>
-      </w:r>
       <w:proofErr w:type="spellStart"/>
-      <w:r>
-        <w:t>compatibité</w:t>
-      </w:r>
       <w:proofErr w:type="spellEnd"/>
-      <w:r>
-        <w:t xml:space="preserve"> doit être vérifiée</w:t>
-      </w:r>
-      <w:r>
-        <w:t>.</w:t>
-      </w:r>
-      <w:r>
-        <w:t xml:space="preserve"> </w:t>
-      </w:r>
     </w:p>
     <w:p>
       <w:pPr>
@@ -1100,6 +1029,20 @@
       </w:r>
       <w:r>
         <w:t xml:space="preserve"> installer</w:t>
+      </w:r>
+    </w:p>
+    <w:p>
+      <w:pPr>
+        <w:pStyle w:val="Titre2"/>
+      </w:pPr>
+      <w:r>
+        <w:t>Archivage : manuel ou automatisé</w:t>
+      </w:r>
+    </w:p>
+    <w:p>
+      <w:pPr/>
+      <w:r>
+        <w:t>L'archivage utilise la fonction native de Thunderbird (classement par année-mois). Sur les postes en 140+, il peut être automatisé par le module AutoarchiveReloaded (archivage des messages au-delà d'une ancienneté — lancé à la demande, recommandé en IMAP, ou au démarrage), tout en conservant le classement année-mois. Sur les versions anciennes, l'archivage reste manuel (sélection par ancienneté ou par date).</w:t>
       </w:r>
     </w:p>
     <w:p>
@@ -1740,91 +1683,36 @@
         </w:tc>
       </w:tr>
       <w:tr>
-        <w:tblPrEx>
-          <w:tblCellMar>
-            <w:top w:w="0" w:type="dxa"/>
-            <w:bottom w:w="0" w:type="dxa"/>
-          </w:tblCellMar>
-        </w:tblPrEx>
-        <w:tc>
-          <w:tcPr>
-            <w:tcW w:w="2900" w:type="dxa"/>
-            <w:tcBorders>
-              <w:top w:val="single" w:sz="1" w:space="0" w:color="BBBBBB"/>
-              <w:left w:val="single" w:sz="1" w:space="0" w:color="BBBBBB"/>
-              <w:bottom w:val="single" w:sz="1" w:space="0" w:color="BBBBBB"/>
-              <w:right w:val="single" w:sz="1" w:space="0" w:color="BBBBBB"/>
-            </w:tcBorders>
-            <w:tcMar>
-              <w:top w:w="60" w:type="dxa"/>
-              <w:left w:w="110" w:type="dxa"/>
-              <w:bottom w:w="60" w:type="dxa"/>
-              <w:right w:w="110" w:type="dxa"/>
-            </w:tcMar>
-            <w:vAlign w:val="center"/>
-          </w:tcPr>
-          <w:p>
-            <w:pPr>
-              <w:spacing w:after="20"/>
-            </w:pPr>
+        <w:tc>
+          <w:tcPr>
+            <w:tcW w:type="dxa" w:w="2900"/>
+          </w:tcPr>
+          <w:p>
             <w:r>
               <w:rPr>
                 <w:b/>
-                <w:bCs/>
               </w:rPr>
-              <w:t>1-push-archives-vers-san.bat</w:t>
-            </w:r>
-          </w:p>
-        </w:tc>
-        <w:tc>
-          <w:tcPr>
-            <w:tcW w:w="4060" w:type="dxa"/>
-            <w:tcBorders>
-              <w:top w:val="single" w:sz="1" w:space="0" w:color="BBBBBB"/>
-              <w:left w:val="single" w:sz="1" w:space="0" w:color="BBBBBB"/>
-              <w:bottom w:val="single" w:sz="1" w:space="0" w:color="BBBBBB"/>
-              <w:right w:val="single" w:sz="1" w:space="0" w:color="BBBBBB"/>
-            </w:tcBorders>
-            <w:tcMar>
-              <w:top w:w="60" w:type="dxa"/>
-              <w:left w:w="110" w:type="dxa"/>
-              <w:bottom w:w="60" w:type="dxa"/>
-              <w:right w:w="110" w:type="dxa"/>
-            </w:tcMar>
-            <w:vAlign w:val="center"/>
-          </w:tcPr>
-          <w:p>
-            <w:pPr>
-              <w:spacing w:after="20"/>
-            </w:pPr>
-            <w:r>
-              <w:t>Envoi de l'archive du profil vers le SAN</w:t>
-            </w:r>
-          </w:p>
-        </w:tc>
-        <w:tc>
-          <w:tcPr>
-            <w:tcW w:w="2400" w:type="dxa"/>
-            <w:tcBorders>
-              <w:top w:val="single" w:sz="1" w:space="0" w:color="BBBBBB"/>
-              <w:left w:val="single" w:sz="1" w:space="0" w:color="BBBBBB"/>
-              <w:bottom w:val="single" w:sz="1" w:space="0" w:color="BBBBBB"/>
-              <w:right w:val="single" w:sz="1" w:space="0" w:color="BBBBBB"/>
-            </w:tcBorders>
-            <w:tcMar>
-              <w:top w:w="60" w:type="dxa"/>
-              <w:left w:w="110" w:type="dxa"/>
-              <w:bottom w:w="60" w:type="dxa"/>
-              <w:right w:w="110" w:type="dxa"/>
-            </w:tcMar>
-            <w:vAlign w:val="center"/>
-          </w:tcPr>
-          <w:p>
-            <w:pPr>
-              <w:spacing w:after="20"/>
-            </w:pPr>
-            <w:r>
-              <w:t>Poste central « mail »</w:t>
+              <w:t>README.md</w:t>
+            </w:r>
+          </w:p>
+        </w:tc>
+        <w:tc>
+          <w:tcPr>
+            <w:tcW w:type="dxa" w:w="4060"/>
+          </w:tcPr>
+          <w:p>
+            <w:r>
+              <w:t>Présentation, démarrage rapide, recette</w:t>
+            </w:r>
+          </w:p>
+        </w:tc>
+        <w:tc>
+          <w:tcPr>
+            <w:tcW w:type="dxa" w:w="2400"/>
+          </w:tcPr>
+          <w:p>
+            <w:r>
+              <w:t>Référence</w:t>
             </w:r>
           </w:p>
         </w:tc>
@@ -1862,7 +1750,7 @@
                 <w:b/>
                 <w:bCs/>
               </w:rPr>
-              <w:t>2-sync-cache-local.bat</w:t>
+              <w:t>1-push-archives-vers-san.bat</w:t>
             </w:r>
           </w:p>
         </w:tc>
@@ -1888,7 +1776,7 @@
               <w:spacing w:after="20"/>
             </w:pPr>
             <w:r>
-              <w:t>Synchro du cache local + passage en lecture seule</w:t>
+              <w:t>Envoi de l'archive du profil vers le SAN</w:t>
             </w:r>
           </w:p>
         </w:tc>
@@ -1914,7 +1802,7 @@
               <w:spacing w:after="20"/>
             </w:pPr>
             <w:r>
-              <w:t>Poste utilisateur (auto)</w:t>
+              <w:t>Poste central « mail »</w:t>
             </w:r>
           </w:p>
         </w:tc>
@@ -1952,7 +1840,7 @@
                 <w:b/>
                 <w:bCs/>
               </w:rPr>
-              <w:t>3-installer-tache-planifiee.bat</w:t>
+              <w:t>2-sync-cache-local.bat</w:t>
             </w:r>
           </w:p>
         </w:tc>
@@ -1978,7 +1866,7 @@
               <w:spacing w:after="20"/>
             </w:pPr>
             <w:r>
-              <w:t>Automatisation de la synchro (quotidien + session)</w:t>
+              <w:t>Synchro du cache local + passage en lecture seule</w:t>
             </w:r>
           </w:p>
         </w:tc>
@@ -2004,7 +1892,7 @@
               <w:spacing w:after="20"/>
             </w:pPr>
             <w:r>
-              <w:t>Poste utilisateur (une fois)</w:t>
+              <w:t>Poste utilisateur (auto)</w:t>
             </w:r>
           </w:p>
         </w:tc>
@@ -2037,6 +1925,201 @@
             <w:pPr>
               <w:spacing w:after="20"/>
             </w:pPr>
+            <w:r>
+              <w:rPr>
+                <w:b/>
+                <w:bCs/>
+              </w:rPr>
+              <w:t>3-installer-tache-planifiee.bat</w:t>
+            </w:r>
+          </w:p>
+        </w:tc>
+        <w:tc>
+          <w:tcPr>
+            <w:tcW w:w="4060" w:type="dxa"/>
+            <w:tcBorders>
+              <w:top w:val="single" w:sz="1" w:space="0" w:color="BBBBBB"/>
+              <w:left w:val="single" w:sz="1" w:space="0" w:color="BBBBBB"/>
+              <w:bottom w:val="single" w:sz="1" w:space="0" w:color="BBBBBB"/>
+              <w:right w:val="single" w:sz="1" w:space="0" w:color="BBBBBB"/>
+            </w:tcBorders>
+            <w:tcMar>
+              <w:top w:w="60" w:type="dxa"/>
+              <w:left w:w="110" w:type="dxa"/>
+              <w:bottom w:w="60" w:type="dxa"/>
+              <w:right w:w="110" w:type="dxa"/>
+            </w:tcMar>
+            <w:vAlign w:val="center"/>
+          </w:tcPr>
+          <w:p>
+            <w:pPr>
+              <w:spacing w:after="20"/>
+            </w:pPr>
+            <w:r>
+              <w:t>Automatisation de la synchro (quotidien + session)</w:t>
+            </w:r>
+          </w:p>
+        </w:tc>
+        <w:tc>
+          <w:tcPr>
+            <w:tcW w:w="2400" w:type="dxa"/>
+            <w:tcBorders>
+              <w:top w:val="single" w:sz="1" w:space="0" w:color="BBBBBB"/>
+              <w:left w:val="single" w:sz="1" w:space="0" w:color="BBBBBB"/>
+              <w:bottom w:val="single" w:sz="1" w:space="0" w:color="BBBBBB"/>
+              <w:right w:val="single" w:sz="1" w:space="0" w:color="BBBBBB"/>
+            </w:tcBorders>
+            <w:tcMar>
+              <w:top w:w="60" w:type="dxa"/>
+              <w:left w:w="110" w:type="dxa"/>
+              <w:bottom w:w="60" w:type="dxa"/>
+              <w:right w:w="110" w:type="dxa"/>
+            </w:tcMar>
+            <w:vAlign w:val="center"/>
+          </w:tcPr>
+          <w:p>
+            <w:pPr>
+              <w:spacing w:after="20"/>
+            </w:pPr>
+            <w:r>
+              <w:t>Poste utilisateur (une fois)</w:t>
+            </w:r>
+          </w:p>
+        </w:tc>
+      </w:tr>
+      <w:tr>
+        <w:tc>
+          <w:tcPr>
+            <w:tcW w:type="dxa" w:w="2900"/>
+          </w:tcPr>
+          <w:p>
+            <w:r>
+              <w:rPr>
+                <w:b/>
+              </w:rPr>
+              <w:t>5-installer-thunderbird-moderne.bat</w:t>
+            </w:r>
+          </w:p>
+        </w:tc>
+        <w:tc>
+          <w:tcPr>
+            <w:tcW w:type="dxa" w:w="4060"/>
+          </w:tcPr>
+          <w:p>
+            <w:r>
+              <w:t>Installe Thunderbird ESR 140+ (silencieux)</w:t>
+            </w:r>
+          </w:p>
+        </w:tc>
+        <w:tc>
+          <w:tcPr>
+            <w:tcW w:type="dxa" w:w="2400"/>
+          </w:tcPr>
+          <w:p>
+            <w:r>
+              <w:t>Poste central (option)</w:t>
+            </w:r>
+          </w:p>
+        </w:tc>
+      </w:tr>
+      <w:tr>
+        <w:tc>
+          <w:tcPr>
+            <w:tcW w:type="dxa" w:w="2900"/>
+          </w:tcPr>
+          <w:p>
+            <w:r>
+              <w:rPr>
+                <w:b/>
+              </w:rPr>
+              <w:t>aide-dates-archivage.bat</w:t>
+            </w:r>
+          </w:p>
+        </w:tc>
+        <w:tc>
+          <w:tcPr>
+            <w:tcW w:type="dxa" w:w="4060"/>
+          </w:tcPr>
+          <w:p>
+            <w:r>
+              <w:t>Calcule les dates butoir (archivage manuel, TB 31–45)</w:t>
+            </w:r>
+          </w:p>
+        </w:tc>
+        <w:tc>
+          <w:tcPr>
+            <w:tcW w:type="dxa" w:w="2400"/>
+          </w:tcPr>
+          <w:p>
+            <w:r>
+              <w:t>Poste central</w:t>
+            </w:r>
+          </w:p>
+        </w:tc>
+      </w:tr>
+      <w:tr>
+        <w:tc>
+          <w:tcPr>
+            <w:tcW w:type="dxa" w:w="2900"/>
+          </w:tcPr>
+          <w:p>
+            <w:r>
+              <w:rPr>
+                <w:b/>
+              </w:rPr>
+              <w:t>policies.json.exemple</w:t>
+            </w:r>
+          </w:p>
+        </w:tc>
+        <w:tc>
+          <w:tcPr>
+            <w:tcW w:type="dxa" w:w="4060"/>
+          </w:tcPr>
+          <w:p>
+            <w:r>
+              <w:t>Modèle de stratégie d'entreprise (force-install du module)</w:t>
+            </w:r>
+          </w:p>
+        </w:tc>
+        <w:tc>
+          <w:tcPr>
+            <w:tcW w:type="dxa" w:w="2400"/>
+          </w:tcPr>
+          <w:p>
+            <w:r>
+              <w:t>Parc (option)</w:t>
+            </w:r>
+          </w:p>
+        </w:tc>
+      </w:tr>
+      <w:tr>
+        <w:tblPrEx>
+          <w:tblCellMar>
+            <w:top w:w="0" w:type="dxa"/>
+            <w:bottom w:w="0" w:type="dxa"/>
+          </w:tblCellMar>
+        </w:tblPrEx>
+        <w:tc>
+          <w:tcPr>
+            <w:tcW w:w="2900" w:type="dxa"/>
+            <w:tcBorders>
+              <w:top w:val="single" w:sz="1" w:space="0" w:color="BBBBBB"/>
+              <w:left w:val="single" w:sz="1" w:space="0" w:color="BBBBBB"/>
+              <w:bottom w:val="single" w:sz="1" w:space="0" w:color="BBBBBB"/>
+              <w:right w:val="single" w:sz="1" w:space="0" w:color="BBBBBB"/>
+            </w:tcBorders>
+            <w:tcMar>
+              <w:top w:w="60" w:type="dxa"/>
+              <w:left w:w="110" w:type="dxa"/>
+              <w:bottom w:w="60" w:type="dxa"/>
+              <w:right w:w="110" w:type="dxa"/>
+            </w:tcMar>
+            <w:vAlign w:val="center"/>
+          </w:tcPr>
+          <w:p>
+            <w:pPr>
+              <w:spacing w:after="20"/>
+            </w:pPr>
             <w:proofErr w:type="spellStart"/>
             <w:proofErr w:type="gramStart"/>
             <w:r>
@@ -2075,11 +2158,8 @@
             <w:vAlign w:val="center"/>
           </w:tcPr>
           <w:p>
-            <w:pPr>
-              <w:spacing w:after="20"/>
-            </w:pPr>
-            <w:r>
-              <w:t>Schémas PNG + sources draw.io éditables</w:t>
+            <w:r>
+              <w:t>Schémas PNG + sources draw.io éditables ; schémas Mermaid intégrés aux fichiers .md</w:t>
             </w:r>
           </w:p>
         </w:tc>
@@ -2106,6 +2186,76 @@
             </w:pPr>
             <w:r>
               <w:t>Référence</w:t>
+            </w:r>
+          </w:p>
+        </w:tc>
+      </w:tr>
+      <w:tr>
+        <w:tc>
+          <w:tcPr>
+            <w:tcW w:type="dxa" w:w="2900"/>
+          </w:tcPr>
+          <w:p>
+            <w:r>
+              <w:rPr>
+                <w:b/>
+              </w:rPr>
+              <w:t>assets/</w:t>
+            </w:r>
+          </w:p>
+        </w:tc>
+        <w:tc>
+          <w:tcPr>
+            <w:tcW w:type="dxa" w:w="4060"/>
+          </w:tcPr>
+          <w:p>
+            <w:r>
+              <w:t>Captures d'écran de la procédure (adresse e-mail masquée)</w:t>
+            </w:r>
+          </w:p>
+        </w:tc>
+        <w:tc>
+          <w:tcPr>
+            <w:tcW w:type="dxa" w:w="2400"/>
+          </w:tcPr>
+          <w:p>
+            <w:r>
+              <w:t>Référence</w:t>
+            </w:r>
+          </w:p>
+        </w:tc>
+      </w:tr>
+      <w:tr>
+        <w:tc>
+          <w:tcPr>
+            <w:tcW w:type="dxa" w:w="2900"/>
+          </w:tcPr>
+          <w:p>
+            <w:r>
+              <w:rPr>
+                <w:b/>
+              </w:rPr>
+              <w:t>AutoarchiveReloaded (module tiers)</w:t>
+            </w:r>
+          </w:p>
+        </w:tc>
+        <w:tc>
+          <w:tcPr>
+            <w:tcW w:type="dxa" w:w="4060"/>
+          </w:tcPr>
+          <w:p>
+            <w:r>
+              <w:t>Auto-archivage par ancienneté (conserve le classement année-mois)</w:t>
+            </w:r>
+          </w:p>
+        </w:tc>
+        <w:tc>
+          <w:tcPr>
+            <w:tcW w:type="dxa" w:w="2400"/>
+          </w:tcPr>
+          <w:p>
+            <w:r>
+              <w:t>Poste central · 140+</w:t>
             </w:r>
           </w:p>
         </w:tc>
@@ -3002,6 +3152,111 @@
           </w:p>
         </w:tc>
       </w:tr>
+      <w:tr>
+        <w:tc>
+          <w:tcPr>
+            <w:tcW w:type="dxa" w:w="3000"/>
+          </w:tcPr>
+          <w:p>
+            <w:r>
+              <w:rPr>
+                <w:b/>
+              </w:rPr>
+              <w:t>Deux versions de Thunderbird sur un même poste</w:t>
+            </w:r>
+          </w:p>
+        </w:tc>
+        <w:tc>
+          <w:tcPr>
+            <w:tcW w:type="dxa" w:w="3360"/>
+          </w:tcPr>
+          <w:p>
+            <w:r>
+              <w:t>Elles ne tournent pas simultanément (instance unique + verrou de profil) ; risque de corruption si le profil est partagé</w:t>
+            </w:r>
+          </w:p>
+        </w:tc>
+        <w:tc>
+          <w:tcPr>
+            <w:tcW w:type="dxa" w:w="3000"/>
+          </w:tcPr>
+          <w:p>
+            <w:r>
+              <w:t>Migrer le poste central en 140+ ; sinon profils séparés + option « -no-remote »</w:t>
+            </w:r>
+          </w:p>
+        </w:tc>
+      </w:tr>
+      <w:tr>
+        <w:tc>
+          <w:tcPr>
+            <w:tcW w:type="dxa" w:w="3000"/>
+          </w:tcPr>
+          <w:p>
+            <w:r>
+              <w:rPr>
+                <w:b/>
+              </w:rPr>
+              <w:t>Module AutoarchiveReloaded (tiers)</w:t>
+            </w:r>
+          </w:p>
+        </w:tc>
+        <w:tc>
+          <w:tcPr>
+            <w:tcW w:type="dxa" w:w="3360"/>
+          </w:tcPr>
+          <w:p>
+            <w:r>
+              <w:t>Module externe : compatibilité et maintenance variables selon la branche de Thunderbird</w:t>
+            </w:r>
+          </w:p>
+        </w:tc>
+        <w:tc>
+          <w:tcPr>
+            <w:tcW w:type="dxa" w:w="3000"/>
+          </w:tcPr>
+          <w:p>
+            <w:r>
+              <w:t>Vérifier la compatibilité (addons.thunderbird.net) ; sinon archivage manuel</w:t>
+            </w:r>
+          </w:p>
+        </w:tc>
+      </w:tr>
+      <w:tr>
+        <w:tc>
+          <w:tcPr>
+            <w:tcW w:type="dxa" w:w="3000"/>
+          </w:tcPr>
+          <w:p>
+            <w:r>
+              <w:rPr>
+                <w:b/>
+              </w:rPr>
+              <w:t>Push SAN non automatique</w:t>
+            </w:r>
+          </w:p>
+        </w:tc>
+        <w:tc>
+          <w:tcPr>
+            <w:tcW w:type="dxa" w:w="3360"/>
+          </w:tcPr>
+          <w:p>
+            <w:r>
+              <w:t>Même avec l'auto-archivage, l'envoi vers le SAN reste un geste manuel (Thunderbird fermé)</w:t>
+            </w:r>
+          </w:p>
+        </w:tc>
+        <w:tc>
+          <w:tcPr>
+            <w:tcW w:type="dxa" w:w="3000"/>
+          </w:tcPr>
+          <w:p>
+            <w:r>
+              <w:t>Lancer 1-push après archivage ; orchestration dédiée si besoin</w:t>
+            </w:r>
+          </w:p>
+        </w:tc>
+      </w:tr>
     </w:tbl>
     <w:p>
       <w:pPr>
@@ -3070,7 +3325,7 @@
                 <w:sz w:val="17"/>
                 <w:szCs w:val="17"/>
               </w:rPr>
-              <w:t>Proposition-Archives-Mail/</w:t>
+              <w:t>Archives-Mail-Thunderbird-Distribution/</w:t>
             </w:r>
           </w:p>
           <w:p>
@@ -3090,7 +3345,7 @@
                 <w:sz w:val="17"/>
                 <w:szCs w:val="17"/>
               </w:rPr>
-              <w:t>├── Note-de-cadrage.docx                     Le présent document</w:t>
+              <w:t>├── README.md                               Présentation, démarrage rapide, recette</w:t>
             </w:r>
           </w:p>
           <w:p>
@@ -3100,7 +3355,17 @@
                 <w:sz w:val="17"/>
                 <w:szCs w:val="17"/>
               </w:rPr>
-              <w:t>├── MODE-OPERATOIRE.md                       Procédure pas-à-pas (agents)</w:t>
+              <w:t>├── MODE-OPERATOIRE.md                      Procédure pas-à-pas (agents) + schémas Mermaid</w:t>
+            </w:r>
+          </w:p>
+          <w:p>
+            <w:r>
+              <w:rPr>
+                <w:rFonts w:ascii="Consolas" w:eastAsia="Consolas" w:hAnsi="Consolas" w:cs="Consolas"/>
+                <w:sz w:val="17"/>
+                <w:szCs w:val="17"/>
+              </w:rPr>
+              <w:t>├── Note-de-cadrage.docx                    Le présent document</w:t>
             </w:r>
           </w:p>
           <w:p>
@@ -3130,7 +3395,7 @@
                 <w:sz w:val="17"/>
                 <w:szCs w:val="17"/>
               </w:rPr>
-              <w:t>│   ├── 1-push-archives-vers-san.bat         Poste central : envoi vers le SAN</w:t>
+              <w:t>│   ├── 1-push-archives-vers-san.bat        Poste central : envoi vers le SAN</w:t>
             </w:r>
           </w:p>
           <w:p>
@@ -3140,7 +3405,7 @@
                 <w:sz w:val="17"/>
                 <w:szCs w:val="17"/>
               </w:rPr>
-              <w:t>│   ├── 2-sync-cache-local.bat               Poste utilisateur : synchro du cache</w:t>
+              <w:t>│   ├── 2-sync-cache-local.bat              Poste utilisateur : synchro du cache</w:t>
             </w:r>
           </w:p>
           <w:p>
@@ -3150,7 +3415,39 @@
                 <w:sz w:val="17"/>
                 <w:szCs w:val="17"/>
               </w:rPr>
-              <w:t>│   └── 3-installer-tache-planifiee.bat      Poste utilisateur : automatisation</w:t>
+              <w:t>│   ├── 3-installer-tache-planifiee.bat     Poste utilisateur : automatisation</w:t>
+            </w:r>
+          </w:p>
+          <w:p>
+            <w:r>
+              <w:rPr>
+                <w:rFonts w:ascii="Consolas" w:eastAsia="Consolas" w:hAnsi="Consolas" w:cs="Consolas"/>
+                <w:sz w:val="17"/>
+                <w:szCs w:val="17"/>
+              </w:rPr>
+              <w:t>│   ├── 5-installer-thunderbird-moderne.bat Poste central : installe TB ESR 140+</w:t>
+            </w:r>
+            <w:proofErr w:type="spellStart"/>
+            <w:proofErr w:type="spellEnd"/>
+          </w:p>
+          <w:p>
+            <w:r>
+              <w:rPr>
+                <w:rFonts w:ascii="Consolas" w:eastAsia="Consolas" w:hAnsi="Consolas" w:cs="Consolas"/>
+                <w:sz w:val="17"/>
+                <w:szCs w:val="17"/>
+              </w:rPr>
+              <w:t>│   ├── aide-dates-archivage.bat            Dates butoir (archivage manuel, TB 31-45)</w:t>
+            </w:r>
+          </w:p>
+          <w:p>
+            <w:r>
+              <w:rPr>
+                <w:rFonts w:ascii="Consolas" w:eastAsia="Consolas" w:hAnsi="Consolas" w:cs="Consolas"/>
+                <w:sz w:val="17"/>
+                <w:szCs w:val="17"/>
+              </w:rPr>
+              <w:t>│   └── policies.json.exemple               Force-install du module (parc)</w:t>
             </w:r>
           </w:p>
           <w:p>
@@ -3170,26 +3467,32 @@
                 <w:sz w:val="17"/>
                 <w:szCs w:val="17"/>
               </w:rPr>
-              <w:t xml:space="preserve">└── </w:t>
-            </w:r>
-            <w:proofErr w:type="spellStart"/>
+              <w:t>├── assets/                                 Captures d'écran (adresse e-mail masquée)</w:t>
+            </w:r>
+          </w:p>
+          <w:p>
             <w:r>
               <w:rPr>
                 <w:rFonts w:ascii="Consolas" w:eastAsia="Consolas" w:hAnsi="Consolas" w:cs="Consolas"/>
                 <w:sz w:val="17"/>
                 <w:szCs w:val="17"/>
               </w:rPr>
-              <w:t>schemas</w:t>
-            </w:r>
+              <w:t>│</w:t>
+            </w:r>
+            <w:proofErr w:type="spellStart"/>
             <w:proofErr w:type="spellEnd"/>
+          </w:p>
+          <w:p>
             <w:r>
               <w:rPr>
                 <w:rFonts w:ascii="Consolas" w:eastAsia="Consolas" w:hAnsi="Consolas" w:cs="Consolas"/>
                 <w:sz w:val="17"/>
                 <w:szCs w:val="17"/>
               </w:rPr>
-              <w:t>/</w:t>
-            </w:r>
+              <w:t>└── schemas/</w:t>
+            </w:r>
+            <w:proofErr w:type="gramStart"/>
+            <w:proofErr w:type="gramEnd"/>
           </w:p>
           <w:p>
             <w:r>
@@ -3198,8 +3501,10 @@
                 <w:sz w:val="17"/>
                 <w:szCs w:val="17"/>
               </w:rPr>
-              <w:t xml:space="preserve">    ├── png/                                 Schémas insérés dans la note</w:t>
-            </w:r>
+              <w:t xml:space="preserve">    ├── png/                                Schémas insérés dans la note</w:t>
+            </w:r>
+            <w:proofErr w:type="gramStart"/>
+            <w:proofErr w:type="gramEnd"/>
           </w:p>
           <w:p>
             <w:r>
@@ -3210,6 +3515,8 @@
               </w:rPr>
               <w:t xml:space="preserve">    │   ├── 1-architecture.png</w:t>
             </w:r>
+            <w:proofErr w:type="gramStart"/>
+            <w:proofErr w:type="gramEnd"/>
           </w:p>
           <w:p>
             <w:r>
@@ -3220,6 +3527,8 @@
               </w:rPr>
               <w:t xml:space="preserve">    │   ├── 2-processus.png</w:t>
             </w:r>
+            <w:proofErr w:type="gramStart"/>
+            <w:proofErr w:type="gramEnd"/>
           </w:p>
           <w:p>
             <w:r>
@@ -3230,6 +3539,8 @@
               </w:rPr>
               <w:t xml:space="preserve">    │   └── 3-anti-verrou.png</w:t>
             </w:r>
+            <w:proofErr w:type="gramStart"/>
+            <w:proofErr w:type="gramEnd"/>
           </w:p>
           <w:p>
             <w:r>
@@ -3238,26 +3549,34 @@
                 <w:sz w:val="17"/>
                 <w:szCs w:val="17"/>
               </w:rPr>
-              <w:t xml:space="preserve">    └── </w:t>
-            </w:r>
-            <w:proofErr w:type="spellStart"/>
+              <w:t xml:space="preserve">    └── drawio/                             Schémas éditables (draw.io)</w:t>
+            </w:r>
+            <w:proofErr w:type="gramStart"/>
+            <w:proofErr w:type="gramEnd"/>
+          </w:p>
+          <w:p>
             <w:r>
               <w:rPr>
                 <w:rFonts w:ascii="Consolas" w:eastAsia="Consolas" w:hAnsi="Consolas" w:cs="Consolas"/>
                 <w:sz w:val="17"/>
                 <w:szCs w:val="17"/>
               </w:rPr>
-              <w:t>drawio</w:t>
-            </w:r>
-            <w:proofErr w:type="spellEnd"/>
+              <w:t xml:space="preserve">        ├── 1-architecture.drawio</w:t>
+            </w:r>
+            <w:proofErr w:type="gramStart"/>
+            <w:proofErr w:type="gramEnd"/>
+          </w:p>
+          <w:p>
             <w:r>
               <w:rPr>
                 <w:rFonts w:ascii="Consolas" w:eastAsia="Consolas" w:hAnsi="Consolas" w:cs="Consolas"/>
                 <w:sz w:val="17"/>
                 <w:szCs w:val="17"/>
               </w:rPr>
-              <w:t>/                              Schémas éditables (draw.io)</w:t>
-            </w:r>
+              <w:t xml:space="preserve">        ├── 2-processus.drawio</w:t>
+            </w:r>
+            <w:proofErr w:type="gramStart"/>
+            <w:proofErr w:type="gramEnd"/>
           </w:p>
           <w:p>
             <w:r>
@@ -3266,57 +3585,9 @@
                 <w:sz w:val="17"/>
                 <w:szCs w:val="17"/>
               </w:rPr>
-              <w:t xml:space="preserve">        ├── 1-</w:t>
+              <w:t xml:space="preserve">        └── 3-anti-verrou.drawio</w:t>
             </w:r>
             <w:proofErr w:type="gramStart"/>
-            <w:r>
-              <w:rPr>
-                <w:rFonts w:ascii="Consolas" w:eastAsia="Consolas" w:hAnsi="Consolas" w:cs="Consolas"/>
-                <w:sz w:val="17"/>
-                <w:szCs w:val="17"/>
-              </w:rPr>
-              <w:t>architecture.drawio</w:t>
-            </w:r>
-            <w:proofErr w:type="gramEnd"/>
-          </w:p>
-          <w:p>
-            <w:r>
-              <w:rPr>
-                <w:rFonts w:ascii="Consolas" w:eastAsia="Consolas" w:hAnsi="Consolas" w:cs="Consolas"/>
-                <w:sz w:val="17"/>
-                <w:szCs w:val="17"/>
-              </w:rPr>
-              <w:t xml:space="preserve">        ├── 2-</w:t>
-            </w:r>
-            <w:proofErr w:type="gramStart"/>
-            <w:r>
-              <w:rPr>
-                <w:rFonts w:ascii="Consolas" w:eastAsia="Consolas" w:hAnsi="Consolas" w:cs="Consolas"/>
-                <w:sz w:val="17"/>
-                <w:szCs w:val="17"/>
-              </w:rPr>
-              <w:t>processus.drawio</w:t>
-            </w:r>
-            <w:proofErr w:type="gramEnd"/>
-          </w:p>
-          <w:p>
-            <w:r>
-              <w:rPr>
-                <w:rFonts w:ascii="Consolas" w:eastAsia="Consolas" w:hAnsi="Consolas" w:cs="Consolas"/>
-                <w:sz w:val="17"/>
-                <w:szCs w:val="17"/>
-              </w:rPr>
-              <w:t xml:space="preserve">        └── 3-anti-</w:t>
-            </w:r>
-            <w:proofErr w:type="gramStart"/>
-            <w:r>
-              <w:rPr>
-                <w:rFonts w:ascii="Consolas" w:eastAsia="Consolas" w:hAnsi="Consolas" w:cs="Consolas"/>
-                <w:sz w:val="17"/>
-                <w:szCs w:val="17"/>
-              </w:rPr>
-              <w:t>verrou.drawio</w:t>
-            </w:r>
             <w:proofErr w:type="gramEnd"/>
           </w:p>
         </w:tc>
@@ -4678,6 +4949,48 @@
           </w:p>
         </w:tc>
       </w:tr>
+      <w:tr>
+        <w:tc>
+          <w:tcPr>
+            <w:tcW w:type="dxa" w:w="700"/>
+          </w:tcPr>
+          <w:p>
+            <w:r>
+              <w:t>T11</w:t>
+            </w:r>
+          </w:p>
+        </w:tc>
+        <w:tc>
+          <w:tcPr>
+            <w:tcW w:type="dxa" w:w="2600"/>
+          </w:tcPr>
+          <w:p>
+            <w:r>
+              <w:t>Archivage automatisé (module)</w:t>
+            </w:r>
+          </w:p>
+        </w:tc>
+        <w:tc>
+          <w:tcPr>
+            <w:tcW w:type="dxa" w:w="3260"/>
+          </w:tcPr>
+          <w:p>
+            <w:r>
+              <w:t>Configurer AutoarchiveReloaded (4 options + ancienneté), lancer l'archivage</w:t>
+            </w:r>
+          </w:p>
+        </w:tc>
+        <w:tc>
+          <w:tcPr>
+            <w:tcW w:type="dxa" w:w="2800"/>
+          </w:tcPr>
+          <w:p>
+            <w:r>
+              <w:t>Messages au-delà du seuil archivés par année-mois (pas un dossier unique)</w:t>
+            </w:r>
+          </w:p>
+        </w:tc>
+      </w:tr>
     </w:tbl>
     <w:p>
       <w:pPr>
@@ -5409,10 +5722,7 @@
           <w:b/>
           <w:bCs/>
         </w:rPr>
-        <w:t xml:space="preserve">Montée de version Thunderbird </w:t>
-      </w:r>
-      <w:r>
-        <w:t>vers une branche ESR maintenue, pour la sécurité.</w:t>
+        <w:t>Montée de version vers Thunderbird 140+ (ESR), désormais recommandée et documentée — à généraliser au parc pour la sécurité.</w:t>
       </w:r>
     </w:p>
     <w:p>

</xml_diff>

<commit_message>
chore: ignore les fichiers verrou Office (~$*) ; re-enregistrement note de cadrage
</commit_message>
<xml_diff>
--- a/Note-de-cadrage.docx
+++ b/Note-de-cadrage.docx
@@ -70,12 +70,6 @@
         <w:gridCol w:w="6960"/>
       </w:tblGrid>
       <w:tr>
-        <w:tblPrEx>
-          <w:tblCellMar>
-            <w:top w:w="0" w:type="dxa"/>
-            <w:bottom w:w="0" w:type="dxa"/>
-          </w:tblCellMar>
-        </w:tblPrEx>
         <w:tc>
           <w:tcPr>
             <w:tcW w:w="2400" w:type="dxa"/>
@@ -129,12 +123,6 @@
         </w:tc>
       </w:tr>
       <w:tr>
-        <w:tblPrEx>
-          <w:tblCellMar>
-            <w:top w:w="0" w:type="dxa"/>
-            <w:bottom w:w="0" w:type="dxa"/>
-          </w:tblCellMar>
-        </w:tblPrEx>
         <w:tc>
           <w:tcPr>
             <w:tcW w:w="2400" w:type="dxa"/>
@@ -188,12 +176,6 @@
         </w:tc>
       </w:tr>
       <w:tr>
-        <w:tblPrEx>
-          <w:tblCellMar>
-            <w:top w:w="0" w:type="dxa"/>
-            <w:bottom w:w="0" w:type="dxa"/>
-          </w:tblCellMar>
-        </w:tblPrEx>
         <w:tc>
           <w:tcPr>
             <w:tcW w:w="2400" w:type="dxa"/>
@@ -247,12 +229,6 @@
         </w:tc>
       </w:tr>
       <w:tr>
-        <w:tblPrEx>
-          <w:tblCellMar>
-            <w:top w:w="0" w:type="dxa"/>
-            <w:bottom w:w="0" w:type="dxa"/>
-          </w:tblCellMar>
-        </w:tblPrEx>
         <w:tc>
           <w:tcPr>
             <w:tcW w:w="2400" w:type="dxa"/>
@@ -306,12 +282,6 @@
         </w:tc>
       </w:tr>
       <w:tr>
-        <w:tblPrEx>
-          <w:tblCellMar>
-            <w:top w:w="0" w:type="dxa"/>
-            <w:bottom w:w="0" w:type="dxa"/>
-          </w:tblCellMar>
-        </w:tblPrEx>
         <w:tc>
           <w:tcPr>
             <w:tcW w:w="2400" w:type="dxa"/>
@@ -368,12 +338,6 @@
         </w:tc>
       </w:tr>
       <w:tr>
-        <w:tblPrEx>
-          <w:tblCellMar>
-            <w:top w:w="0" w:type="dxa"/>
-            <w:bottom w:w="0" w:type="dxa"/>
-          </w:tblCellMar>
-        </w:tblPrEx>
         <w:tc>
           <w:tcPr>
             <w:tcW w:w="2400" w:type="dxa"/>
@@ -821,9 +785,12 @@
       </w:pPr>
       <w:proofErr w:type="gramStart"/>
       <w:r>
-        <w:t>parc potentiellement hétérogène (clients Thunderbird anciens, branches 31.x à 69.x) ; la version 140+ (ESR) est désormais privilégiée, en particulier sur le poste central ;</w:t>
+        <w:t>parc</w:t>
       </w:r>
       <w:proofErr w:type="gramEnd"/>
+      <w:r>
+        <w:t xml:space="preserve"> potentiellement hétérogène (clients Thunderbird anciens, branches 31.x à 69.x) ; la version 140+ (ESR) est désormais privilégiée, en particulier sur le poste central ;</w:t>
+      </w:r>
     </w:p>
     <w:p>
       <w:pPr>
@@ -836,13 +803,12 @@
       </w:pPr>
       <w:proofErr w:type="gramStart"/>
       <w:r>
-        <w:t>compatibilité ascendante vérifiée jusqu'à Thunderbird 140+ ; les versions anciennes restent supportées pour la consultation.</w:t>
+        <w:t>compatibilité</w:t>
       </w:r>
       <w:proofErr w:type="gramEnd"/>
-      <w:proofErr w:type="spellStart"/>
-      <w:proofErr w:type="spellEnd"/>
-      <w:proofErr w:type="spellStart"/>
-      <w:proofErr w:type="spellEnd"/>
+      <w:r>
+        <w:t xml:space="preserve"> ascendante vérifiée jusqu'à Thunderbird 140+ ; les versions anciennes restent supportées pour la consultation.</w:t>
+      </w:r>
     </w:p>
     <w:p>
       <w:pPr>
@@ -1040,9 +1006,12 @@
       </w:r>
     </w:p>
     <w:p>
-      <w:pPr/>
-      <w:r>
-        <w:t>L'archivage utilise la fonction native de Thunderbird (classement par année-mois). Sur les postes en 140+, il peut être automatisé par le module AutoarchiveReloaded (archivage des messages au-delà d'une ancienneté — lancé à la demande, recommandé en IMAP, ou au démarrage), tout en conservant le classement année-mois. Sur les versions anciennes, l'archivage reste manuel (sélection par ancienneté ou par date).</w:t>
+      <w:r>
+        <w:t xml:space="preserve">L'archivage utilise la fonction native de Thunderbird (classement par année-mois). Sur les postes en 140+, il peut être automatisé par le module AutoarchiveReloaded (archivage des messages au-delà d'une ancienneté — lancé à la demande, recommandé en IMAP, ou au </w:t>
+      </w:r>
+      <w:r>
+        <w:lastRenderedPageBreak/>
+        <w:t>démarrage), tout en conservant le classement année-mois. Sur les versions anciennes, l'archivage reste manuel (sélection par ancienneté ou par date).</w:t>
       </w:r>
     </w:p>
     <w:p>
@@ -1104,7 +1073,6 @@
         <w:spacing w:after="140" w:line="276" w:lineRule="auto"/>
       </w:pPr>
       <w:r>
-        <w:lastRenderedPageBreak/>
         <w:t xml:space="preserve">Compatibilité assurée de la version </w:t>
       </w:r>
       <w:r>
@@ -1231,8 +1199,8 @@
           <w:noProof/>
         </w:rPr>
         <w:drawing>
-          <wp:inline distT="0" distB="0" distL="0" distR="0" wp14:anchorId="1BACB61A" wp14:editId="4BD2C7DB">
-            <wp:extent cx="5715000" cy="3695700"/>
+          <wp:inline distT="0" distB="0" distL="0" distR="0" wp14:anchorId="1BACB61A" wp14:editId="7AD07B23">
+            <wp:extent cx="5486400" cy="3547872"/>
             <wp:effectExtent l="0" t="0" r="0" b="0"/>
             <wp:docPr id="1" name="Architecture d'ensemble" descr="Architecture d'ensemble" title="Architecture d'ensemble"/>
             <wp:cNvGraphicFramePr>
@@ -1257,7 +1225,7 @@
                   <pic:spPr bwMode="auto">
                     <a:xfrm>
                       <a:off x="0" y="0"/>
-                      <a:ext cx="5715000" cy="3695700"/>
+                      <a:ext cx="5495674" cy="3553869"/>
                     </a:xfrm>
                     <a:prstGeom prst="rect">
                       <a:avLst/>
@@ -1287,23 +1255,9 @@
       </w:r>
     </w:p>
     <w:p>
-      <w:pPr>
-        <w:rPr>
-          <w:b/>
-          <w:bCs/>
-          <w:color w:val="000091"/>
-          <w:sz w:val="30"/>
-          <w:szCs w:val="30"/>
-        </w:rPr>
-      </w:pPr>
       <w:r>
         <w:br w:type="page"/>
       </w:r>
-    </w:p>
-    <w:p>
-      <w:pPr>
-        <w:pStyle w:val="Titre1"/>
-      </w:pPr>
       <w:r>
         <w:lastRenderedPageBreak/>
         <w:t>4. Déroulé du processus</w:t>
@@ -1407,7 +1361,6 @@
         <w:rPr>
           <w:noProof/>
         </w:rPr>
-        <w:lastRenderedPageBreak/>
         <w:drawing>
           <wp:inline distT="0" distB="0" distL="0" distR="0" wp14:anchorId="2E15FC1C" wp14:editId="1C759AA3">
             <wp:extent cx="5715000" cy="2800350"/>
@@ -1461,6 +1414,7 @@
           <w:sz w:val="18"/>
           <w:szCs w:val="18"/>
         </w:rPr>
+        <w:lastRenderedPageBreak/>
         <w:t>Figure 3 — À gauche, le scénario dangereux ; à droite, la solution retenue.</w:t>
       </w:r>
     </w:p>
@@ -1495,12 +1449,6 @@
         <w:gridCol w:w="2400"/>
       </w:tblGrid>
       <w:tr>
-        <w:tblPrEx>
-          <w:tblCellMar>
-            <w:top w:w="0" w:type="dxa"/>
-            <w:bottom w:w="0" w:type="dxa"/>
-          </w:tblCellMar>
-        </w:tblPrEx>
         <w:trPr>
           <w:tblHeader/>
         </w:trPr>
@@ -1593,12 +1541,6 @@
         </w:tc>
       </w:tr>
       <w:tr>
-        <w:tblPrEx>
-          <w:tblCellMar>
-            <w:top w:w="0" w:type="dxa"/>
-            <w:bottom w:w="0" w:type="dxa"/>
-          </w:tblCellMar>
-        </w:tblPrEx>
         <w:tc>
           <w:tcPr>
             <w:tcW w:w="2900" w:type="dxa"/>
@@ -1685,7 +1627,7 @@
       <w:tr>
         <w:tc>
           <w:tcPr>
-            <w:tcW w:type="dxa" w:w="2900"/>
+            <w:tcW w:w="2900" w:type="dxa"/>
           </w:tcPr>
           <w:p>
             <w:r>
@@ -1698,7 +1640,7 @@
         </w:tc>
         <w:tc>
           <w:tcPr>
-            <w:tcW w:type="dxa" w:w="4060"/>
+            <w:tcW w:w="4060" w:type="dxa"/>
           </w:tcPr>
           <w:p>
             <w:r>
@@ -1708,7 +1650,7 @@
         </w:tc>
         <w:tc>
           <w:tcPr>
-            <w:tcW w:type="dxa" w:w="2400"/>
+            <w:tcW w:w="2400" w:type="dxa"/>
           </w:tcPr>
           <w:p>
             <w:r>
@@ -1718,12 +1660,6 @@
         </w:tc>
       </w:tr>
       <w:tr>
-        <w:tblPrEx>
-          <w:tblCellMar>
-            <w:top w:w="0" w:type="dxa"/>
-            <w:bottom w:w="0" w:type="dxa"/>
-          </w:tblCellMar>
-        </w:tblPrEx>
         <w:tc>
           <w:tcPr>
             <w:tcW w:w="2900" w:type="dxa"/>
@@ -1808,12 +1744,6 @@
         </w:tc>
       </w:tr>
       <w:tr>
-        <w:tblPrEx>
-          <w:tblCellMar>
-            <w:top w:w="0" w:type="dxa"/>
-            <w:bottom w:w="0" w:type="dxa"/>
-          </w:tblCellMar>
-        </w:tblPrEx>
         <w:tc>
           <w:tcPr>
             <w:tcW w:w="2900" w:type="dxa"/>
@@ -1898,12 +1828,6 @@
         </w:tc>
       </w:tr>
       <w:tr>
-        <w:tblPrEx>
-          <w:tblCellMar>
-            <w:top w:w="0" w:type="dxa"/>
-            <w:bottom w:w="0" w:type="dxa"/>
-          </w:tblCellMar>
-        </w:tblPrEx>
         <w:tc>
           <w:tcPr>
             <w:tcW w:w="2900" w:type="dxa"/>
@@ -1990,7 +1914,7 @@
       <w:tr>
         <w:tc>
           <w:tcPr>
-            <w:tcW w:type="dxa" w:w="2900"/>
+            <w:tcW w:w="2900" w:type="dxa"/>
           </w:tcPr>
           <w:p>
             <w:r>
@@ -2003,7 +1927,7 @@
         </w:tc>
         <w:tc>
           <w:tcPr>
-            <w:tcW w:type="dxa" w:w="4060"/>
+            <w:tcW w:w="4060" w:type="dxa"/>
           </w:tcPr>
           <w:p>
             <w:r>
@@ -2013,7 +1937,7 @@
         </w:tc>
         <w:tc>
           <w:tcPr>
-            <w:tcW w:type="dxa" w:w="2400"/>
+            <w:tcW w:w="2400" w:type="dxa"/>
           </w:tcPr>
           <w:p>
             <w:r>
@@ -2025,7 +1949,7 @@
       <w:tr>
         <w:tc>
           <w:tcPr>
-            <w:tcW w:type="dxa" w:w="2900"/>
+            <w:tcW w:w="2900" w:type="dxa"/>
           </w:tcPr>
           <w:p>
             <w:r>
@@ -2038,7 +1962,7 @@
         </w:tc>
         <w:tc>
           <w:tcPr>
-            <w:tcW w:type="dxa" w:w="4060"/>
+            <w:tcW w:w="4060" w:type="dxa"/>
           </w:tcPr>
           <w:p>
             <w:r>
@@ -2048,7 +1972,7 @@
         </w:tc>
         <w:tc>
           <w:tcPr>
-            <w:tcW w:type="dxa" w:w="2400"/>
+            <w:tcW w:w="2400" w:type="dxa"/>
           </w:tcPr>
           <w:p>
             <w:r>
@@ -2060,7 +1984,7 @@
       <w:tr>
         <w:tc>
           <w:tcPr>
-            <w:tcW w:type="dxa" w:w="2900"/>
+            <w:tcW w:w="2900" w:type="dxa"/>
           </w:tcPr>
           <w:p>
             <w:r>
@@ -2073,7 +1997,7 @@
         </w:tc>
         <w:tc>
           <w:tcPr>
-            <w:tcW w:type="dxa" w:w="4060"/>
+            <w:tcW w:w="4060" w:type="dxa"/>
           </w:tcPr>
           <w:p>
             <w:r>
@@ -2083,7 +2007,7 @@
         </w:tc>
         <w:tc>
           <w:tcPr>
-            <w:tcW w:type="dxa" w:w="2400"/>
+            <w:tcW w:w="2400" w:type="dxa"/>
           </w:tcPr>
           <w:p>
             <w:r>
@@ -2093,12 +2017,6 @@
         </w:tc>
       </w:tr>
       <w:tr>
-        <w:tblPrEx>
-          <w:tblCellMar>
-            <w:top w:w="0" w:type="dxa"/>
-            <w:bottom w:w="0" w:type="dxa"/>
-          </w:tblCellMar>
-        </w:tblPrEx>
         <w:tc>
           <w:tcPr>
             <w:tcW w:w="2900" w:type="dxa"/>
@@ -2193,7 +2111,7 @@
       <w:tr>
         <w:tc>
           <w:tcPr>
-            <w:tcW w:type="dxa" w:w="2900"/>
+            <w:tcW w:w="2900" w:type="dxa"/>
           </w:tcPr>
           <w:p>
             <w:r>
@@ -2206,7 +2124,7 @@
         </w:tc>
         <w:tc>
           <w:tcPr>
-            <w:tcW w:type="dxa" w:w="4060"/>
+            <w:tcW w:w="4060" w:type="dxa"/>
           </w:tcPr>
           <w:p>
             <w:r>
@@ -2216,7 +2134,7 @@
         </w:tc>
         <w:tc>
           <w:tcPr>
-            <w:tcW w:type="dxa" w:w="2400"/>
+            <w:tcW w:w="2400" w:type="dxa"/>
           </w:tcPr>
           <w:p>
             <w:r>
@@ -2228,7 +2146,7 @@
       <w:tr>
         <w:tc>
           <w:tcPr>
-            <w:tcW w:type="dxa" w:w="2900"/>
+            <w:tcW w:w="2900" w:type="dxa"/>
           </w:tcPr>
           <w:p>
             <w:r>
@@ -2241,7 +2159,7 @@
         </w:tc>
         <w:tc>
           <w:tcPr>
-            <w:tcW w:type="dxa" w:w="4060"/>
+            <w:tcW w:w="4060" w:type="dxa"/>
           </w:tcPr>
           <w:p>
             <w:r>
@@ -2251,7 +2169,7 @@
         </w:tc>
         <w:tc>
           <w:tcPr>
-            <w:tcW w:type="dxa" w:w="2400"/>
+            <w:tcW w:w="2400" w:type="dxa"/>
           </w:tcPr>
           <w:p>
             <w:r>
@@ -2292,12 +2210,6 @@
         <w:gridCol w:w="3000"/>
       </w:tblGrid>
       <w:tr>
-        <w:tblPrEx>
-          <w:tblCellMar>
-            <w:top w:w="0" w:type="dxa"/>
-            <w:bottom w:w="0" w:type="dxa"/>
-          </w:tblCellMar>
-        </w:tblPrEx>
         <w:trPr>
           <w:tblHeader/>
         </w:trPr>
@@ -2390,12 +2302,6 @@
         </w:tc>
       </w:tr>
       <w:tr>
-        <w:tblPrEx>
-          <w:tblCellMar>
-            <w:top w:w="0" w:type="dxa"/>
-            <w:bottom w:w="0" w:type="dxa"/>
-          </w:tblCellMar>
-        </w:tblPrEx>
         <w:tc>
           <w:tcPr>
             <w:tcW w:w="3000" w:type="dxa"/>
@@ -2497,12 +2403,6 @@
         </w:tc>
       </w:tr>
       <w:tr>
-        <w:tblPrEx>
-          <w:tblCellMar>
-            <w:top w:w="0" w:type="dxa"/>
-            <w:bottom w:w="0" w:type="dxa"/>
-          </w:tblCellMar>
-        </w:tblPrEx>
         <w:tc>
           <w:tcPr>
             <w:tcW w:w="3000" w:type="dxa"/>
@@ -2593,12 +2493,6 @@
         </w:tc>
       </w:tr>
       <w:tr>
-        <w:tblPrEx>
-          <w:tblCellMar>
-            <w:top w:w="0" w:type="dxa"/>
-            <w:bottom w:w="0" w:type="dxa"/>
-          </w:tblCellMar>
-        </w:tblPrEx>
         <w:tc>
           <w:tcPr>
             <w:tcW w:w="3000" w:type="dxa"/>
@@ -2627,7 +2521,6 @@
                 <w:b/>
                 <w:bCs/>
               </w:rPr>
-              <w:lastRenderedPageBreak/>
               <w:t>robocopy</w:t>
             </w:r>
             <w:proofErr w:type="spellEnd"/>
@@ -2703,12 +2596,6 @@
         </w:tc>
       </w:tr>
       <w:tr>
-        <w:tblPrEx>
-          <w:tblCellMar>
-            <w:top w:w="0" w:type="dxa"/>
-            <w:bottom w:w="0" w:type="dxa"/>
-          </w:tblCellMar>
-        </w:tblPrEx>
         <w:tc>
           <w:tcPr>
             <w:tcW w:w="3000" w:type="dxa"/>
@@ -2797,12 +2684,6 @@
         </w:tc>
       </w:tr>
       <w:tr>
-        <w:tblPrEx>
-          <w:tblCellMar>
-            <w:top w:w="0" w:type="dxa"/>
-            <w:bottom w:w="0" w:type="dxa"/>
-          </w:tblCellMar>
-        </w:tblPrEx>
         <w:tc>
           <w:tcPr>
             <w:tcW w:w="3000" w:type="dxa"/>
@@ -2829,6 +2710,7 @@
                 <w:b/>
                 <w:bCs/>
               </w:rPr>
+              <w:lastRenderedPageBreak/>
               <w:t>Versions anciennes (31.x–45.x)</w:t>
             </w:r>
           </w:p>
@@ -2887,12 +2769,6 @@
         </w:tc>
       </w:tr>
       <w:tr>
-        <w:tblPrEx>
-          <w:tblCellMar>
-            <w:top w:w="0" w:type="dxa"/>
-            <w:bottom w:w="0" w:type="dxa"/>
-          </w:tblCellMar>
-        </w:tblPrEx>
         <w:tc>
           <w:tcPr>
             <w:tcW w:w="3000" w:type="dxa"/>
@@ -2973,12 +2849,6 @@
         </w:tc>
       </w:tr>
       <w:tr>
-        <w:tblPrEx>
-          <w:tblCellMar>
-            <w:top w:w="0" w:type="dxa"/>
-            <w:bottom w:w="0" w:type="dxa"/>
-          </w:tblCellMar>
-        </w:tblPrEx>
         <w:tc>
           <w:tcPr>
             <w:tcW w:w="3000" w:type="dxa"/>
@@ -3059,12 +2929,6 @@
         </w:tc>
       </w:tr>
       <w:tr>
-        <w:tblPrEx>
-          <w:tblCellMar>
-            <w:top w:w="0" w:type="dxa"/>
-            <w:bottom w:w="0" w:type="dxa"/>
-          </w:tblCellMar>
-        </w:tblPrEx>
         <w:tc>
           <w:tcPr>
             <w:tcW w:w="3000" w:type="dxa"/>
@@ -3155,7 +3019,7 @@
       <w:tr>
         <w:tc>
           <w:tcPr>
-            <w:tcW w:type="dxa" w:w="3000"/>
+            <w:tcW w:w="3000" w:type="dxa"/>
           </w:tcPr>
           <w:p>
             <w:r>
@@ -3168,7 +3032,7 @@
         </w:tc>
         <w:tc>
           <w:tcPr>
-            <w:tcW w:type="dxa" w:w="3360"/>
+            <w:tcW w:w="3360" w:type="dxa"/>
           </w:tcPr>
           <w:p>
             <w:r>
@@ -3178,7 +3042,7 @@
         </w:tc>
         <w:tc>
           <w:tcPr>
-            <w:tcW w:type="dxa" w:w="3000"/>
+            <w:tcW w:w="3000" w:type="dxa"/>
           </w:tcPr>
           <w:p>
             <w:r>
@@ -3190,7 +3054,7 @@
       <w:tr>
         <w:tc>
           <w:tcPr>
-            <w:tcW w:type="dxa" w:w="3000"/>
+            <w:tcW w:w="3000" w:type="dxa"/>
           </w:tcPr>
           <w:p>
             <w:r>
@@ -3203,7 +3067,7 @@
         </w:tc>
         <w:tc>
           <w:tcPr>
-            <w:tcW w:type="dxa" w:w="3360"/>
+            <w:tcW w:w="3360" w:type="dxa"/>
           </w:tcPr>
           <w:p>
             <w:r>
@@ -3213,7 +3077,7 @@
         </w:tc>
         <w:tc>
           <w:tcPr>
-            <w:tcW w:type="dxa" w:w="3000"/>
+            <w:tcW w:w="3000" w:type="dxa"/>
           </w:tcPr>
           <w:p>
             <w:r>
@@ -3225,7 +3089,7 @@
       <w:tr>
         <w:tc>
           <w:tcPr>
-            <w:tcW w:type="dxa" w:w="3000"/>
+            <w:tcW w:w="3000" w:type="dxa"/>
           </w:tcPr>
           <w:p>
             <w:r>
@@ -3238,7 +3102,7 @@
         </w:tc>
         <w:tc>
           <w:tcPr>
-            <w:tcW w:type="dxa" w:w="3360"/>
+            <w:tcW w:w="3360" w:type="dxa"/>
           </w:tcPr>
           <w:p>
             <w:r>
@@ -3248,7 +3112,7 @@
         </w:tc>
         <w:tc>
           <w:tcPr>
-            <w:tcW w:type="dxa" w:w="3000"/>
+            <w:tcW w:w="3000" w:type="dxa"/>
           </w:tcPr>
           <w:p>
             <w:r>
@@ -3295,12 +3159,6 @@
         <w:gridCol w:w="9360"/>
       </w:tblGrid>
       <w:tr>
-        <w:tblPrEx>
-          <w:tblCellMar>
-            <w:top w:w="0" w:type="dxa"/>
-            <w:bottom w:w="0" w:type="dxa"/>
-          </w:tblCellMar>
-        </w:tblPrEx>
         <w:tc>
           <w:tcPr>
             <w:tcW w:w="9360" w:type="dxa"/>
@@ -3427,8 +3285,6 @@
               </w:rPr>
               <w:t>│   ├── 5-installer-thunderbird-moderne.bat Poste central : installe TB ESR 140+</w:t>
             </w:r>
-            <w:proofErr w:type="spellStart"/>
-            <w:proofErr w:type="spellEnd"/>
           </w:p>
           <w:p>
             <w:r>
@@ -3479,8 +3335,6 @@
               </w:rPr>
               <w:t>│</w:t>
             </w:r>
-            <w:proofErr w:type="spellStart"/>
-            <w:proofErr w:type="spellEnd"/>
           </w:p>
           <w:p>
             <w:r>
@@ -3491,8 +3345,6 @@
               </w:rPr>
               <w:t>└── schemas/</w:t>
             </w:r>
-            <w:proofErr w:type="gramStart"/>
-            <w:proofErr w:type="gramEnd"/>
           </w:p>
           <w:p>
             <w:r>
@@ -3503,8 +3355,6 @@
               </w:rPr>
               <w:t xml:space="preserve">    ├── png/                                Schémas insérés dans la note</w:t>
             </w:r>
-            <w:proofErr w:type="gramStart"/>
-            <w:proofErr w:type="gramEnd"/>
           </w:p>
           <w:p>
             <w:r>
@@ -3515,8 +3365,6 @@
               </w:rPr>
               <w:t xml:space="preserve">    │   ├── 1-architecture.png</w:t>
             </w:r>
-            <w:proofErr w:type="gramStart"/>
-            <w:proofErr w:type="gramEnd"/>
           </w:p>
           <w:p>
             <w:r>
@@ -3527,8 +3375,6 @@
               </w:rPr>
               <w:t xml:space="preserve">    │   ├── 2-processus.png</w:t>
             </w:r>
-            <w:proofErr w:type="gramStart"/>
-            <w:proofErr w:type="gramEnd"/>
           </w:p>
           <w:p>
             <w:r>
@@ -3539,8 +3385,6 @@
               </w:rPr>
               <w:t xml:space="preserve">    │   └── 3-anti-verrou.png</w:t>
             </w:r>
-            <w:proofErr w:type="gramStart"/>
-            <w:proofErr w:type="gramEnd"/>
           </w:p>
           <w:p>
             <w:r>
@@ -3551,8 +3395,6 @@
               </w:rPr>
               <w:t xml:space="preserve">    └── drawio/                             Schémas éditables (draw.io)</w:t>
             </w:r>
-            <w:proofErr w:type="gramStart"/>
-            <w:proofErr w:type="gramEnd"/>
           </w:p>
           <w:p>
             <w:r>
@@ -3561,21 +3403,17 @@
                 <w:sz w:val="17"/>
                 <w:szCs w:val="17"/>
               </w:rPr>
-              <w:t xml:space="preserve">        ├── 1-architecture.drawio</w:t>
+              <w:t xml:space="preserve">        ├── 1-</w:t>
             </w:r>
             <w:proofErr w:type="gramStart"/>
-            <w:proofErr w:type="gramEnd"/>
-          </w:p>
-          <w:p>
             <w:r>
               <w:rPr>
                 <w:rFonts w:ascii="Consolas" w:eastAsia="Consolas" w:hAnsi="Consolas" w:cs="Consolas"/>
                 <w:sz w:val="17"/>
                 <w:szCs w:val="17"/>
               </w:rPr>
-              <w:t xml:space="preserve">        ├── 2-processus.drawio</w:t>
-            </w:r>
-            <w:proofErr w:type="gramStart"/>
+              <w:t>architecture.drawio</w:t>
+            </w:r>
             <w:proofErr w:type="gramEnd"/>
           </w:p>
           <w:p>
@@ -3585,9 +3423,37 @@
                 <w:sz w:val="17"/>
                 <w:szCs w:val="17"/>
               </w:rPr>
-              <w:t xml:space="preserve">        └── 3-anti-verrou.drawio</w:t>
+              <w:t xml:space="preserve">        ├── 2-</w:t>
             </w:r>
             <w:proofErr w:type="gramStart"/>
+            <w:r>
+              <w:rPr>
+                <w:rFonts w:ascii="Consolas" w:eastAsia="Consolas" w:hAnsi="Consolas" w:cs="Consolas"/>
+                <w:sz w:val="17"/>
+                <w:szCs w:val="17"/>
+              </w:rPr>
+              <w:t>processus.drawio</w:t>
+            </w:r>
+            <w:proofErr w:type="gramEnd"/>
+          </w:p>
+          <w:p>
+            <w:r>
+              <w:rPr>
+                <w:rFonts w:ascii="Consolas" w:eastAsia="Consolas" w:hAnsi="Consolas" w:cs="Consolas"/>
+                <w:sz w:val="17"/>
+                <w:szCs w:val="17"/>
+              </w:rPr>
+              <w:t xml:space="preserve">        └── 3-anti-</w:t>
+            </w:r>
+            <w:proofErr w:type="gramStart"/>
+            <w:r>
+              <w:rPr>
+                <w:rFonts w:ascii="Consolas" w:eastAsia="Consolas" w:hAnsi="Consolas" w:cs="Consolas"/>
+                <w:sz w:val="17"/>
+                <w:szCs w:val="17"/>
+              </w:rPr>
+              <w:t>verrou.drawio</w:t>
+            </w:r>
             <w:proofErr w:type="gramEnd"/>
           </w:p>
         </w:tc>
@@ -3598,6 +3464,7 @@
         <w:pStyle w:val="Titre1"/>
       </w:pPr>
       <w:r>
+        <w:lastRenderedPageBreak/>
         <w:t>9. Recette et plan de test</w:t>
       </w:r>
     </w:p>
@@ -3673,12 +3540,6 @@
         <w:gridCol w:w="2800"/>
       </w:tblGrid>
       <w:tr>
-        <w:tblPrEx>
-          <w:tblCellMar>
-            <w:top w:w="0" w:type="dxa"/>
-            <w:bottom w:w="0" w:type="dxa"/>
-          </w:tblCellMar>
-        </w:tblPrEx>
         <w:trPr>
           <w:tblHeader/>
         </w:trPr>
@@ -3707,7 +3568,6 @@
                 <w:bCs/>
                 <w:color w:val="FFFFFF"/>
               </w:rPr>
-              <w:lastRenderedPageBreak/>
               <w:t>#</w:t>
             </w:r>
           </w:p>
@@ -3801,12 +3661,6 @@
         </w:tc>
       </w:tr>
       <w:tr>
-        <w:tblPrEx>
-          <w:tblCellMar>
-            <w:top w:w="0" w:type="dxa"/>
-            <w:bottom w:w="0" w:type="dxa"/>
-          </w:tblCellMar>
-        </w:tblPrEx>
         <w:tc>
           <w:tcPr>
             <w:tcW w:w="700" w:type="dxa"/>
@@ -3913,12 +3767,6 @@
         </w:tc>
       </w:tr>
       <w:tr>
-        <w:tblPrEx>
-          <w:tblCellMar>
-            <w:top w:w="0" w:type="dxa"/>
-            <w:bottom w:w="0" w:type="dxa"/>
-          </w:tblCellMar>
-        </w:tblPrEx>
         <w:tc>
           <w:tcPr>
             <w:tcW w:w="700" w:type="dxa"/>
@@ -4029,12 +3877,6 @@
         </w:tc>
       </w:tr>
       <w:tr>
-        <w:tblPrEx>
-          <w:tblCellMar>
-            <w:top w:w="0" w:type="dxa"/>
-            <w:bottom w:w="0" w:type="dxa"/>
-          </w:tblCellMar>
-        </w:tblPrEx>
         <w:tc>
           <w:tcPr>
             <w:tcW w:w="700" w:type="dxa"/>
@@ -4141,12 +3983,6 @@
         </w:tc>
       </w:tr>
       <w:tr>
-        <w:tblPrEx>
-          <w:tblCellMar>
-            <w:top w:w="0" w:type="dxa"/>
-            <w:bottom w:w="0" w:type="dxa"/>
-          </w:tblCellMar>
-        </w:tblPrEx>
         <w:tc>
           <w:tcPr>
             <w:tcW w:w="700" w:type="dxa"/>
@@ -4261,12 +4097,6 @@
         </w:tc>
       </w:tr>
       <w:tr>
-        <w:tblPrEx>
-          <w:tblCellMar>
-            <w:top w:w="0" w:type="dxa"/>
-            <w:bottom w:w="0" w:type="dxa"/>
-          </w:tblCellMar>
-        </w:tblPrEx>
         <w:tc>
           <w:tcPr>
             <w:tcW w:w="700" w:type="dxa"/>
@@ -4373,12 +4203,6 @@
         </w:tc>
       </w:tr>
       <w:tr>
-        <w:tblPrEx>
-          <w:tblCellMar>
-            <w:top w:w="0" w:type="dxa"/>
-            <w:bottom w:w="0" w:type="dxa"/>
-          </w:tblCellMar>
-        </w:tblPrEx>
         <w:tc>
           <w:tcPr>
             <w:tcW w:w="700" w:type="dxa"/>
@@ -4489,12 +4313,6 @@
         </w:tc>
       </w:tr>
       <w:tr>
-        <w:tblPrEx>
-          <w:tblCellMar>
-            <w:top w:w="0" w:type="dxa"/>
-            <w:bottom w:w="0" w:type="dxa"/>
-          </w:tblCellMar>
-        </w:tblPrEx>
         <w:tc>
           <w:tcPr>
             <w:tcW w:w="700" w:type="dxa"/>
@@ -4609,12 +4427,6 @@
         </w:tc>
       </w:tr>
       <w:tr>
-        <w:tblPrEx>
-          <w:tblCellMar>
-            <w:top w:w="0" w:type="dxa"/>
-            <w:bottom w:w="0" w:type="dxa"/>
-          </w:tblCellMar>
-        </w:tblPrEx>
         <w:tc>
           <w:tcPr>
             <w:tcW w:w="700" w:type="dxa"/>
@@ -4726,12 +4538,6 @@
         </w:tc>
       </w:tr>
       <w:tr>
-        <w:tblPrEx>
-          <w:tblCellMar>
-            <w:top w:w="0" w:type="dxa"/>
-            <w:bottom w:w="0" w:type="dxa"/>
-          </w:tblCellMar>
-        </w:tblPrEx>
         <w:tc>
           <w:tcPr>
             <w:tcW w:w="700" w:type="dxa"/>
@@ -4838,12 +4644,6 @@
         </w:tc>
       </w:tr>
       <w:tr>
-        <w:tblPrEx>
-          <w:tblCellMar>
-            <w:top w:w="0" w:type="dxa"/>
-            <w:bottom w:w="0" w:type="dxa"/>
-          </w:tblCellMar>
-        </w:tblPrEx>
         <w:tc>
           <w:tcPr>
             <w:tcW w:w="700" w:type="dxa"/>
@@ -4952,7 +4752,7 @@
       <w:tr>
         <w:tc>
           <w:tcPr>
-            <w:tcW w:type="dxa" w:w="700"/>
+            <w:tcW w:w="700" w:type="dxa"/>
           </w:tcPr>
           <w:p>
             <w:r>
@@ -4962,7 +4762,7 @@
         </w:tc>
         <w:tc>
           <w:tcPr>
-            <w:tcW w:type="dxa" w:w="2600"/>
+            <w:tcW w:w="2600" w:type="dxa"/>
           </w:tcPr>
           <w:p>
             <w:r>
@@ -4972,7 +4772,7 @@
         </w:tc>
         <w:tc>
           <w:tcPr>
-            <w:tcW w:type="dxa" w:w="3260"/>
+            <w:tcW w:w="3260" w:type="dxa"/>
           </w:tcPr>
           <w:p>
             <w:r>
@@ -4982,7 +4782,7 @@
         </w:tc>
         <w:tc>
           <w:tcPr>
-            <w:tcW w:type="dxa" w:w="2800"/>
+            <w:tcW w:w="2800" w:type="dxa"/>
           </w:tcPr>
           <w:p>
             <w:r>
@@ -5031,12 +4831,6 @@
         <w:gridCol w:w="2900"/>
       </w:tblGrid>
       <w:tr>
-        <w:tblPrEx>
-          <w:tblCellMar>
-            <w:top w:w="0" w:type="dxa"/>
-            <w:bottom w:w="0" w:type="dxa"/>
-          </w:tblCellMar>
-        </w:tblPrEx>
         <w:trPr>
           <w:tblHeader/>
         </w:trPr>
@@ -5129,12 +4923,6 @@
         </w:tc>
       </w:tr>
       <w:tr>
-        <w:tblPrEx>
-          <w:tblCellMar>
-            <w:top w:w="0" w:type="dxa"/>
-            <w:bottom w:w="0" w:type="dxa"/>
-          </w:tblCellMar>
-        </w:tblPrEx>
         <w:tc>
           <w:tcPr>
             <w:tcW w:w="1700" w:type="dxa"/>
@@ -5187,7 +4975,11 @@
               <w:spacing w:after="20"/>
             </w:pPr>
             <w:r>
-              <w:t>Créer le partage SAN et les droits ; mettre en place la sauvegarde de l'archive maître ; désigner 1 poste central + 2 postes utilisateurs pilotes</w:t>
+              <w:t xml:space="preserve">Créer le partage SAN et les droits ; mettre en place la sauvegarde de l'archive maître ; </w:t>
+            </w:r>
+            <w:r>
+              <w:lastRenderedPageBreak/>
+              <w:t>désigner 1 poste central + 2 postes utilisateurs pilotes</w:t>
             </w:r>
           </w:p>
         </w:tc>
@@ -5213,18 +5005,13 @@
               <w:spacing w:after="20"/>
             </w:pPr>
             <w:r>
+              <w:lastRenderedPageBreak/>
               <w:t>Environnement pilote prêt et sauvegardé</w:t>
             </w:r>
           </w:p>
         </w:tc>
       </w:tr>
       <w:tr>
-        <w:tblPrEx>
-          <w:tblCellMar>
-            <w:top w:w="0" w:type="dxa"/>
-            <w:bottom w:w="0" w:type="dxa"/>
-          </w:tblCellMar>
-        </w:tblPrEx>
         <w:tc>
           <w:tcPr>
             <w:tcW w:w="1700" w:type="dxa"/>
@@ -5309,12 +5096,6 @@
         </w:tc>
       </w:tr>
       <w:tr>
-        <w:tblPrEx>
-          <w:tblCellMar>
-            <w:top w:w="0" w:type="dxa"/>
-            <w:bottom w:w="0" w:type="dxa"/>
-          </w:tblCellMar>
-        </w:tblPrEx>
         <w:tc>
           <w:tcPr>
             <w:tcW w:w="1700" w:type="dxa"/>
@@ -5399,12 +5180,6 @@
         </w:tc>
       </w:tr>
       <w:tr>
-        <w:tblPrEx>
-          <w:tblCellMar>
-            <w:top w:w="0" w:type="dxa"/>
-            <w:bottom w:w="0" w:type="dxa"/>
-          </w:tblCellMar>
-        </w:tblPrEx>
         <w:tc>
           <w:tcPr>
             <w:tcW w:w="1700" w:type="dxa"/>
@@ -5489,12 +5264,6 @@
         </w:tc>
       </w:tr>
       <w:tr>
-        <w:tblPrEx>
-          <w:tblCellMar>
-            <w:top w:w="0" w:type="dxa"/>
-            <w:bottom w:w="0" w:type="dxa"/>
-          </w:tblCellMar>
-        </w:tblPrEx>
         <w:tc>
           <w:tcPr>
             <w:tcW w:w="1700" w:type="dxa"/>
@@ -5521,7 +5290,6 @@
                 <w:b/>
                 <w:bCs/>
               </w:rPr>
-              <w:lastRenderedPageBreak/>
               <w:t>4 · Exploitation</w:t>
             </w:r>
           </w:p>

</xml_diff>

<commit_message>
docs(note-de-cadrage): retire la recommandation Dovecot (piste §11)
</commit_message>
<xml_diff>
--- a/Note-de-cadrage.docx
+++ b/Note-de-cadrage.docx
@@ -5362,34 +5362,6 @@
       </w:pPr>
       <w:r>
         <w:t>Pour un technicien souhaitant faire évoluer la démarche (les schémas draw.io sont fournis et modifiables) :</w:t>
-      </w:r>
-    </w:p>
-    <w:p>
-      <w:pPr>
-        <w:pStyle w:val="Paragraphedeliste"/>
-        <w:numPr>
-          <w:ilvl w:val="0"/>
-          <w:numId w:val="2"/>
-        </w:numPr>
-        <w:spacing w:after="80" w:line="276" w:lineRule="auto"/>
-      </w:pPr>
-      <w:r>
-        <w:rPr>
-          <w:b/>
-          <w:bCs/>
-        </w:rPr>
-        <w:t xml:space="preserve">Serveur d'archives IMAP en lecture seule </w:t>
-      </w:r>
-      <w:r>
-        <w:t xml:space="preserve">(ex. </w:t>
-      </w:r>
-      <w:proofErr w:type="spellStart"/>
-      <w:r>
-        <w:t>Dovecot</w:t>
-      </w:r>
-      <w:proofErr w:type="spellEnd"/>
-      <w:r>
-        <w:t>) : évite les copies locales et offre une vraie lecture concurrente — cible recommandée si de nombreux lecteurs partagent une même grosse archive.</w:t>
       </w:r>
     </w:p>
     <w:p>

</xml_diff>